<commit_message>
:books: docs: Arrumando a documentação
</commit_message>
<xml_diff>
--- a/Documents/Documents/Sprint07_Task078_Implementar_Validacoes_Para_A_Classe_Supplier.docx
+++ b/Documents/Documents/Sprint07_Task078_Implementar_Validacoes_Para_A_Classe_Supplier.docx
@@ -769,7 +769,7 @@
           </w:tcPr>
           <w:p>
             <w:r>
-              <w:t>4</w:t>
+              <w:t>20</w:t>
             </w:r>
           </w:p>
         </w:tc>
@@ -779,7 +779,7 @@
           </w:tcPr>
           <w:p>
             <w:r>
-              <w:t>4</w:t>
+              <w:t>20</w:t>
             </w:r>
           </w:p>
         </w:tc>
@@ -839,55 +839,83 @@
     </w:tbl>
     <w:p/>
     <w:p>
-      <w:pPr>
-        <w:ind w:firstLine="708"/>
-      </w:pPr>
-      <w:bookmarkStart w:id="0" w:name="_Hlk200092608"/>
-      <w:r>
-        <w:t xml:space="preserve">Nessa </w:t>
+      <w:r>
+        <w:t xml:space="preserve">Nesta sprint, o foco foi a implementação de validações, padronizações e melhorias de segurança para a classe </w:t>
       </w:r>
       <w:proofErr w:type="spellStart"/>
       <w:r>
-        <w:t>task</w:t>
+        <w:t>Supplier</w:t>
       </w:r>
       <w:proofErr w:type="spellEnd"/>
       <w:r>
-        <w:t>, foi desenvolvido a validação para o</w:t>
-      </w:r>
-      <w:r>
-        <w:t>s</w:t>
-      </w:r>
-      <w:r>
-        <w:t xml:space="preserve"> campo</w:t>
-      </w:r>
-      <w:r>
-        <w:t>s</w:t>
-      </w:r>
-      <w:r>
-        <w:t xml:space="preserve"> de “</w:t>
-      </w:r>
-      <w:r>
-        <w:t xml:space="preserve">Corporate </w:t>
+        <w:t>.</w:t>
+      </w:r>
+    </w:p>
+    <w:p>
+      <w:r>
+        <w:t>Padrão de Resposta e Tratamento de Erros Foi definido um padrão para o tratamento de erros da API, garantindo consistência e clareza nas respostas enviadas ao cliente. Esse padrão estabelece a forma como os erros são estruturados, incluindo informações como código de status HTTP, código interno da aplicação, mensagem descritiva e, quando aplicável, detalhes adicionais para auxiliar no diagnóstico do problema. Dessa forma, os consumidores da API conseguem identificar rapidamente a causa do erro e aplicar as devidas correções, além de facilitar o monitoramento e a manutenção do sistema.</w:t>
+      </w:r>
+    </w:p>
+    <w:p>
+      <w:r>
+        <w:t xml:space="preserve">Simplificação da </w:t>
       </w:r>
       <w:proofErr w:type="spellStart"/>
       <w:r>
-        <w:t>name</w:t>
+        <w:t>Controller</w:t>
       </w:r>
       <w:proofErr w:type="spellEnd"/>
       <w:r>
+        <w:t xml:space="preserve"> (</w:t>
+      </w:r>
+      <w:proofErr w:type="spellStart"/>
+      <w:r>
+        <w:t>SupplierController</w:t>
+      </w:r>
+      <w:proofErr w:type="spellEnd"/>
+      <w:proofErr w:type="gramStart"/>
+      <w:r>
+        <w:t>) Houve</w:t>
+      </w:r>
+      <w:proofErr w:type="gramEnd"/>
+      <w:r>
+        <w:t xml:space="preserve"> uma redução e simplificação significativa da quantidade de código presente na </w:t>
+      </w:r>
+      <w:proofErr w:type="spellStart"/>
+      <w:r>
+        <w:t>Controller</w:t>
+      </w:r>
+      <w:proofErr w:type="spellEnd"/>
+      <w:r>
+        <w:t xml:space="preserve"> de </w:t>
+      </w:r>
+      <w:proofErr w:type="spellStart"/>
+      <w:r>
+        <w:t>Supplier</w:t>
+      </w:r>
+      <w:proofErr w:type="spellEnd"/>
+      <w:r>
+        <w:t xml:space="preserve">. Essa melhoria foi alcançada por meio da padronização de respostas, reutilização de componentes comuns e centralização das regras de tratamento de erros e validações. Como resultado, a </w:t>
+      </w:r>
+      <w:proofErr w:type="spellStart"/>
+      <w:r>
+        <w:t>Controller</w:t>
+      </w:r>
+      <w:proofErr w:type="spellEnd"/>
+      <w:r>
+        <w:t xml:space="preserve"> ficou mais enxuta, de fácil manutenção, tornando o código mais legível, escalável e menos propenso a falhas com o uso das seguintes classes de exceção: </w:t>
+      </w:r>
+      <w:proofErr w:type="spellStart"/>
+      <w:r>
+        <w:t>ExceptionBadRequest.cs</w:t>
+      </w:r>
+      <w:proofErr w:type="spellEnd"/>
+      <w:r>
         <w:t xml:space="preserve">, </w:t>
       </w:r>
-      <w:proofErr w:type="gramStart"/>
-      <w:r>
-        <w:t>Trade</w:t>
-      </w:r>
-      <w:proofErr w:type="gramEnd"/>
-      <w:r>
-        <w:t xml:space="preserve"> </w:t>
-      </w:r>
       <w:proofErr w:type="spellStart"/>
       <w:r>
-        <w:t>name</w:t>
+        <w:t>ExceptionConflict.cs</w:t>
       </w:r>
       <w:proofErr w:type="spellEnd"/>
       <w:r>
@@ -895,7 +923,7 @@
       </w:r>
       <w:proofErr w:type="spellStart"/>
       <w:r>
-        <w:t>cnpj</w:t>
+        <w:t>ExceptionForbidden.cs</w:t>
       </w:r>
       <w:proofErr w:type="spellEnd"/>
       <w:r>
@@ -903,31 +931,167 @@
       </w:r>
       <w:proofErr w:type="spellStart"/>
       <w:r>
-        <w:t>email</w:t>
+        <w:t>ExceptionNotFound.cs</w:t>
       </w:r>
       <w:proofErr w:type="spellEnd"/>
       <w:r>
+        <w:t xml:space="preserve"> e </w:t>
+      </w:r>
+      <w:proofErr w:type="spellStart"/>
+      <w:r>
+        <w:t>ExceptionUnauthorized.cs</w:t>
+      </w:r>
+      <w:proofErr w:type="spellEnd"/>
+      <w:r>
+        <w:t>.</w:t>
+      </w:r>
+    </w:p>
+    <w:p>
+      <w:r>
+        <w:t xml:space="preserve">Validações Específicas da Classe </w:t>
+      </w:r>
+      <w:proofErr w:type="spellStart"/>
+      <w:r>
+        <w:t>Supplier</w:t>
+      </w:r>
+      <w:proofErr w:type="spellEnd"/>
+      <w:r>
+        <w:t xml:space="preserve"> Foram criadas validações para os campos '</w:t>
+      </w:r>
+      <w:proofErr w:type="spellStart"/>
+      <w:r>
+        <w:t>CorporateName</w:t>
+      </w:r>
+      <w:proofErr w:type="spellEnd"/>
+      <w:r>
+        <w:t>' e '</w:t>
+      </w:r>
+      <w:proofErr w:type="spellStart"/>
+      <w:r>
+        <w:t>TradeName</w:t>
+      </w:r>
+      <w:proofErr w:type="spellEnd"/>
+      <w:r>
+        <w:t>'. Foi implementada uma verificação para impedir o cadastro quando os campos obrigatórios estiverem vazios ou quando o '</w:t>
+      </w:r>
+      <w:proofErr w:type="spellStart"/>
+      <w:r>
+        <w:t>CpfCnpj</w:t>
+      </w:r>
+      <w:proofErr w:type="spellEnd"/>
+      <w:r>
+        <w:t xml:space="preserve">' já estiver registrado no banco de dados. Foram aplicadas correções na validação de tamanho nos campos de </w:t>
+      </w:r>
+      <w:proofErr w:type="spellStart"/>
+      <w:r>
+        <w:t>CorporateName</w:t>
+      </w:r>
+      <w:proofErr w:type="spellEnd"/>
+      <w:r>
         <w:t xml:space="preserve">, </w:t>
       </w:r>
       <w:proofErr w:type="spellStart"/>
       <w:r>
-        <w:t>phone</w:t>
+        <w:t>TradeName</w:t>
       </w:r>
       <w:proofErr w:type="spellEnd"/>
       <w:r>
-        <w:t xml:space="preserve">, postal </w:t>
+        <w:t xml:space="preserve">, Street, </w:t>
       </w:r>
       <w:proofErr w:type="spellStart"/>
       <w:r>
-        <w:t>code</w:t>
+        <w:t>District</w:t>
       </w:r>
       <w:proofErr w:type="spellEnd"/>
       <w:r>
+        <w:t xml:space="preserve"> e City em </w:t>
+      </w:r>
+      <w:proofErr w:type="spellStart"/>
+      <w:r>
+        <w:lastRenderedPageBreak/>
+        <w:t>SupplierDTO</w:t>
+      </w:r>
+      <w:proofErr w:type="spellEnd"/>
+      <w:r>
+        <w:t xml:space="preserve">, utilizando </w:t>
+      </w:r>
+      <w:proofErr w:type="spellStart"/>
+      <w:r>
+        <w:t>QtdCaractersValidator</w:t>
+      </w:r>
+      <w:proofErr w:type="spellEnd"/>
+      <w:r>
+        <w:t xml:space="preserve">. Foi implementada uma validação no método DELETE para que ocorra um erro ao tentar deletar um </w:t>
+      </w:r>
+      <w:proofErr w:type="spellStart"/>
+      <w:r>
+        <w:t>Supplier</w:t>
+      </w:r>
+      <w:proofErr w:type="spellEnd"/>
+      <w:r>
+        <w:t xml:space="preserve"> que está sendo utilizado por outras classes ou possui vínculos ativos, garantindo a integridade referencial.</w:t>
+      </w:r>
+    </w:p>
+    <w:p>
+      <w:r>
+        <w:t xml:space="preserve">Autenticação e Versionamento Autenticação JWT: Foi implementada a Autenticação JWT completa para proteger a </w:t>
+      </w:r>
+      <w:proofErr w:type="spellStart"/>
+      <w:r>
+        <w:t>SupplierController</w:t>
+      </w:r>
+      <w:proofErr w:type="spellEnd"/>
+      <w:r>
+        <w:t>. A proteção é aplicada via anotações [</w:t>
+      </w:r>
+      <w:proofErr w:type="spellStart"/>
+      <w:r>
+        <w:t>Authorize</w:t>
+      </w:r>
+      <w:proofErr w:type="spellEnd"/>
+      <w:r>
+        <w:t xml:space="preserve">], permitindo que apenas usuários com um token válido acessem os recursos. Versionamento de Rotas: As rotas foram </w:t>
+      </w:r>
+      <w:proofErr w:type="spellStart"/>
+      <w:r>
+        <w:t>versionadas</w:t>
+      </w:r>
+      <w:proofErr w:type="spellEnd"/>
+      <w:r>
+        <w:t xml:space="preserve"> para api/v1/ através do uso de [Route("api/v1/[</w:t>
+      </w:r>
+      <w:proofErr w:type="spellStart"/>
+      <w:r>
+        <w:t>controller</w:t>
+      </w:r>
+      <w:proofErr w:type="spellEnd"/>
+      <w:r>
+        <w:t>]")]. Isso garante que a API possa evoluir no futuro (</w:t>
+      </w:r>
+      <w:proofErr w:type="spellStart"/>
+      <w:r>
+        <w:t>ex</w:t>
+      </w:r>
+      <w:proofErr w:type="spellEnd"/>
+      <w:r>
+        <w:t>: api/v2/) sem quebrar a integração com clientes existentes. Padronização de Retorno: Os métodos de validação foram revisados para padronizar os retornos de erro (4xx/5xx).</w:t>
+      </w:r>
+    </w:p>
+    <w:p>
+      <w:r>
+        <w:t xml:space="preserve">Diagrama De Classe A validação foi feita considerando os atributos declarados na classe: Id, </w:t>
+      </w:r>
+      <w:proofErr w:type="spellStart"/>
+      <w:r>
+        <w:t>CorporateName</w:t>
+      </w:r>
+      <w:proofErr w:type="spellEnd"/>
+      <w:r>
         <w:t xml:space="preserve">, </w:t>
       </w:r>
       <w:proofErr w:type="spellStart"/>
       <w:r>
-        <w:t>street</w:t>
+        <w:t>TradeName</w:t>
       </w:r>
       <w:proofErr w:type="spellEnd"/>
       <w:r>
@@ -935,73 +1099,43 @@
       </w:r>
       <w:proofErr w:type="spellStart"/>
       <w:r>
-        <w:t>number</w:t>
+        <w:t>CpfCnpj</w:t>
       </w:r>
       <w:proofErr w:type="spellEnd"/>
       <w:r>
+        <w:t xml:space="preserve">, Email, Phone, </w:t>
+      </w:r>
+      <w:proofErr w:type="spellStart"/>
+      <w:r>
+        <w:t>PostalCode</w:t>
+      </w:r>
+      <w:proofErr w:type="spellEnd"/>
+      <w:r>
+        <w:t xml:space="preserve">, Street, </w:t>
+      </w:r>
+      <w:proofErr w:type="spellStart"/>
+      <w:r>
+        <w:t>Number</w:t>
+      </w:r>
+      <w:proofErr w:type="spellEnd"/>
+      <w:r>
         <w:t xml:space="preserve">, </w:t>
       </w:r>
       <w:proofErr w:type="spellStart"/>
       <w:r>
-        <w:t>distinct</w:t>
+        <w:t>District</w:t>
       </w:r>
       <w:proofErr w:type="spellEnd"/>
       <w:r>
-        <w:t xml:space="preserve">, </w:t>
+        <w:t xml:space="preserve">, City e </w:t>
       </w:r>
       <w:proofErr w:type="spellStart"/>
       <w:r>
-        <w:t>city</w:t>
+        <w:t>State</w:t>
       </w:r>
       <w:proofErr w:type="spellEnd"/>
       <w:r>
-        <w:t xml:space="preserve"> e </w:t>
-      </w:r>
-      <w:proofErr w:type="spellStart"/>
-      <w:r>
-        <w:t>state</w:t>
-      </w:r>
-      <w:proofErr w:type="spellEnd"/>
-      <w:r>
-        <w:t xml:space="preserve">” para a classe </w:t>
-      </w:r>
-      <w:proofErr w:type="spellStart"/>
-      <w:r>
-        <w:t>supplier</w:t>
-      </w:r>
-      <w:proofErr w:type="spellEnd"/>
-      <w:r>
-        <w:t xml:space="preserve">, essa classe faz a </w:t>
-      </w:r>
-      <w:r>
-        <w:t>valida</w:t>
-      </w:r>
-      <w:r>
-        <w:t>ções dos dados, assim</w:t>
-      </w:r>
-      <w:r>
-        <w:t xml:space="preserve"> </w:t>
-      </w:r>
-      <w:r>
-        <w:t>prevenindo</w:t>
-      </w:r>
-      <w:r>
-        <w:t xml:space="preserve"> dados incorretos</w:t>
-      </w:r>
-      <w:r>
-        <w:t>, como dados duplicados e vazios</w:t>
-      </w:r>
-      <w:r>
         <w:t>.</w:t>
-      </w:r>
-      <w:r>
-        <w:t xml:space="preserve"> </w:t>
-      </w:r>
-    </w:p>
-    <w:bookmarkEnd w:id="0"/>
-    <w:p>
-      <w:r>
-        <w:t>Diagrama de classe:</w:t>
       </w:r>
     </w:p>
     <w:p>
@@ -1051,7 +1185,6 @@
     </w:p>
     <w:p>
       <w:r>
-        <w:lastRenderedPageBreak/>
         <w:t>Testes realizados:</w:t>
       </w:r>
     </w:p>
@@ -1077,6 +1210,7 @@
         <w:rPr>
           <w:noProof/>
         </w:rPr>
+        <w:lastRenderedPageBreak/>
         <w:drawing>
           <wp:inline distT="0" distB="0" distL="0" distR="0" wp14:anchorId="26E6B067" wp14:editId="3E96C379">
             <wp:extent cx="6472555" cy="5408295"/>
@@ -1274,9 +1408,9 @@
         </w:rPr>
         <w:lastRenderedPageBreak/>
         <w:drawing>
-          <wp:inline distT="0" distB="0" distL="0" distR="0" wp14:anchorId="14A29DDC" wp14:editId="3DBFA038">
-            <wp:extent cx="6472555" cy="6224905"/>
-            <wp:effectExtent l="0" t="0" r="4445" b="4445"/>
+          <wp:inline distT="0" distB="0" distL="0" distR="0" wp14:anchorId="14A29DDC" wp14:editId="1AFE8D07">
+            <wp:extent cx="6472555" cy="5372100"/>
+            <wp:effectExtent l="0" t="0" r="4445" b="0"/>
             <wp:docPr id="208041309" name="Imagem 1"/>
             <wp:cNvGraphicFramePr>
               <a:graphicFrameLocks xmlns:a="http://schemas.openxmlformats.org/drawingml/2006/main" noChangeAspect="1"/>
@@ -1297,7 +1431,7 @@
                   <pic:spPr>
                     <a:xfrm>
                       <a:off x="0" y="0"/>
-                      <a:ext cx="6472555" cy="6224905"/>
+                      <a:ext cx="6472555" cy="5372100"/>
                     </a:xfrm>
                     <a:prstGeom prst="rect">
                       <a:avLst/>
@@ -1321,11 +1455,10 @@
         <w:rPr>
           <w:noProof/>
         </w:rPr>
-        <w:lastRenderedPageBreak/>
         <w:drawing>
-          <wp:inline distT="0" distB="0" distL="0" distR="0" wp14:anchorId="3A897F91" wp14:editId="0F82C2D5">
-            <wp:extent cx="6472555" cy="4299585"/>
-            <wp:effectExtent l="0" t="0" r="4445" b="5715"/>
+          <wp:inline distT="0" distB="0" distL="0" distR="0" wp14:anchorId="3A897F91" wp14:editId="0E175C42">
+            <wp:extent cx="6472555" cy="3070860"/>
+            <wp:effectExtent l="0" t="0" r="4445" b="0"/>
             <wp:docPr id="230985053" name="Imagem 1"/>
             <wp:cNvGraphicFramePr>
               <a:graphicFrameLocks xmlns:a="http://schemas.openxmlformats.org/drawingml/2006/main" noChangeAspect="1"/>
@@ -1346,7 +1479,7 @@
                   <pic:spPr>
                     <a:xfrm>
                       <a:off x="0" y="0"/>
-                      <a:ext cx="6472555" cy="4299585"/>
+                      <a:ext cx="6472555" cy="3070860"/>
                     </a:xfrm>
                     <a:prstGeom prst="rect">
                       <a:avLst/>
@@ -1360,6 +1493,9 @@
       </w:r>
     </w:p>
     <w:p>
+      <w:pPr>
+        <w:spacing w:before="176"/>
+      </w:pPr>
       <w:r>
         <w:br/>
         <w:t>Deletar:</w:t>
@@ -1368,6 +1504,10 @@
         <w:br/>
       </w:r>
       <w:r>
+        <w:rPr>
+          <w:noProof/>
+        </w:rPr>
+        <w:lastRenderedPageBreak/>
         <w:drawing>
           <wp:inline distT="0" distB="0" distL="0" distR="0" wp14:anchorId="38274287" wp14:editId="63160CB8">
             <wp:extent cx="6472555" cy="2065020"/>
@@ -1404,7 +1544,392 @@
           </wp:inline>
         </w:drawing>
       </w:r>
+      <w:r>
+        <w:br/>
+      </w:r>
+      <w:r>
+        <w:br/>
+      </w:r>
     </w:p>
+    <w:p>
+      <w:pPr>
+        <w:spacing w:before="176"/>
+        <w:jc w:val="center"/>
+      </w:pPr>
+    </w:p>
+    <w:p>
+      <w:pPr>
+        <w:shd w:val="clear" w:color="auto" w:fill="000000" w:themeFill="text1"/>
+        <w:jc w:val="center"/>
+      </w:pPr>
+      <w:r>
+        <w:rPr>
+          <w:b/>
+          <w:bCs/>
+          <w:color w:val="FFFFFF" w:themeColor="background1"/>
+          <w:sz w:val="24"/>
+          <w:szCs w:val="24"/>
+        </w:rPr>
+        <w:t>Assinaturas</w:t>
+      </w:r>
+    </w:p>
+    <w:p>
+      <w:pPr>
+        <w:pStyle w:val="Corpodetexto"/>
+        <w:spacing w:before="26"/>
+        <w:rPr>
+          <w:b/>
+          <w:sz w:val="20"/>
+        </w:rPr>
+      </w:pPr>
+    </w:p>
+    <w:tbl>
+      <w:tblPr>
+        <w:tblW w:w="8405" w:type="dxa"/>
+        <w:tblInd w:w="526" w:type="dxa"/>
+        <w:tblLayout w:type="fixed"/>
+        <w:tblCellMar>
+          <w:left w:w="0" w:type="dxa"/>
+          <w:right w:w="0" w:type="dxa"/>
+        </w:tblCellMar>
+        <w:tblLook w:val="01A0" w:firstRow="1" w:lastRow="0" w:firstColumn="1" w:lastColumn="1" w:noHBand="0" w:noVBand="0"/>
+      </w:tblPr>
+      <w:tblGrid>
+        <w:gridCol w:w="4691"/>
+        <w:gridCol w:w="3714"/>
+      </w:tblGrid>
+      <w:tr>
+        <w:trPr>
+          <w:trHeight w:val="2040"/>
+        </w:trPr>
+        <w:tc>
+          <w:tcPr>
+            <w:tcW w:w="4691" w:type="dxa"/>
+            <w:tcBorders>
+              <w:top w:val="nil"/>
+              <w:left w:val="nil"/>
+              <w:bottom w:val="nil"/>
+              <w:right w:val="nil"/>
+            </w:tcBorders>
+          </w:tcPr>
+          <w:p>
+            <w:pPr>
+              <w:pStyle w:val="TableParagraph"/>
+              <w:pBdr>
+                <w:top w:val="nil"/>
+                <w:left w:val="nil"/>
+                <w:bottom w:val="nil"/>
+                <w:right w:val="nil"/>
+                <w:between w:val="nil"/>
+              </w:pBdr>
+              <w:spacing w:line="231" w:lineRule="exact"/>
+              <w:ind w:left="4" w:right="580"/>
+              <w:jc w:val="center"/>
+              <w:rPr>
+                <w:rFonts w:ascii="Trebuchet MS" w:hAnsi="Trebuchet MS"/>
+                <w:sz w:val="20"/>
+                <w:szCs w:val="20"/>
+              </w:rPr>
+            </w:pPr>
+            <w:r>
+              <w:rPr>
+                <w:rFonts w:ascii="Trebuchet MS" w:hAnsi="Trebuchet MS"/>
+                <w:spacing w:val="-2"/>
+                <w:sz w:val="20"/>
+                <w:szCs w:val="20"/>
+              </w:rPr>
+              <w:t>Vinicius Lúcio Marcolino Da Silva</w:t>
+            </w:r>
+            <w:r>
+              <w:br/>
+            </w:r>
+            <w:r>
+              <w:br/>
+            </w:r>
+            <w:r>
+              <w:br/>
+            </w:r>
+            <w:r>
+              <w:br/>
+            </w:r>
+            <w:r>
+              <w:br/>
+            </w:r>
+          </w:p>
+          <w:p>
+            <w:pPr>
+              <w:pStyle w:val="TableParagraph"/>
+              <w:pBdr>
+                <w:top w:val="nil"/>
+                <w:left w:val="nil"/>
+                <w:bottom w:val="nil"/>
+                <w:right w:val="nil"/>
+                <w:between w:val="nil"/>
+              </w:pBdr>
+              <w:spacing w:line="231" w:lineRule="exact"/>
+              <w:ind w:left="4" w:right="580"/>
+              <w:jc w:val="center"/>
+              <w:rPr>
+                <w:rFonts w:ascii="Trebuchet MS" w:hAnsi="Trebuchet MS"/>
+                <w:sz w:val="20"/>
+                <w:szCs w:val="20"/>
+              </w:rPr>
+            </w:pPr>
+          </w:p>
+          <w:p>
+            <w:pPr>
+              <w:pStyle w:val="TableParagraph"/>
+              <w:pBdr>
+                <w:top w:val="nil"/>
+                <w:left w:val="nil"/>
+                <w:bottom w:val="nil"/>
+                <w:right w:val="nil"/>
+                <w:between w:val="nil"/>
+              </w:pBdr>
+              <w:spacing w:line="231" w:lineRule="exact"/>
+              <w:ind w:left="4" w:right="580"/>
+              <w:jc w:val="center"/>
+              <w:rPr>
+                <w:rFonts w:ascii="Trebuchet MS" w:hAnsi="Trebuchet MS"/>
+                <w:sz w:val="20"/>
+                <w:szCs w:val="20"/>
+              </w:rPr>
+            </w:pPr>
+          </w:p>
+          <w:p>
+            <w:pPr>
+              <w:pStyle w:val="TableParagraph"/>
+              <w:pBdr>
+                <w:top w:val="nil"/>
+                <w:left w:val="nil"/>
+                <w:bottom w:val="nil"/>
+                <w:right w:val="nil"/>
+                <w:between w:val="nil"/>
+              </w:pBdr>
+              <w:spacing w:line="231" w:lineRule="exact"/>
+              <w:ind w:left="4" w:right="580"/>
+              <w:jc w:val="center"/>
+              <w:rPr>
+                <w:rFonts w:ascii="Trebuchet MS" w:hAnsi="Trebuchet MS"/>
+                <w:sz w:val="20"/>
+                <w:szCs w:val="20"/>
+              </w:rPr>
+            </w:pPr>
+          </w:p>
+          <w:p>
+            <w:pPr>
+              <w:pStyle w:val="TableParagraph"/>
+              <w:pBdr>
+                <w:top w:val="nil"/>
+                <w:left w:val="nil"/>
+                <w:bottom w:val="nil"/>
+                <w:right w:val="nil"/>
+                <w:between w:val="nil"/>
+              </w:pBdr>
+              <w:spacing w:line="231" w:lineRule="exact"/>
+              <w:ind w:left="4" w:right="580"/>
+              <w:jc w:val="center"/>
+              <w:rPr>
+                <w:rFonts w:ascii="Trebuchet MS" w:hAnsi="Trebuchet MS"/>
+                <w:sz w:val="20"/>
+                <w:szCs w:val="20"/>
+              </w:rPr>
+            </w:pPr>
+          </w:p>
+        </w:tc>
+        <w:tc>
+          <w:tcPr>
+            <w:tcW w:w="3714" w:type="dxa"/>
+            <w:tcBorders>
+              <w:top w:val="nil"/>
+              <w:left w:val="nil"/>
+              <w:bottom w:val="nil"/>
+              <w:right w:val="nil"/>
+            </w:tcBorders>
+          </w:tcPr>
+          <w:p>
+            <w:pPr>
+              <w:pStyle w:val="TableParagraph"/>
+              <w:pBdr>
+                <w:top w:val="nil"/>
+                <w:left w:val="nil"/>
+                <w:bottom w:val="nil"/>
+                <w:right w:val="nil"/>
+                <w:between w:val="nil"/>
+              </w:pBdr>
+              <w:spacing w:line="231" w:lineRule="exact"/>
+              <w:ind w:left="1250"/>
+              <w:rPr>
+                <w:rFonts w:ascii="Trebuchet MS" w:hAnsi="Trebuchet MS"/>
+                <w:sz w:val="20"/>
+                <w:szCs w:val="20"/>
+              </w:rPr>
+            </w:pPr>
+          </w:p>
+        </w:tc>
+      </w:tr>
+      <w:tr>
+        <w:trPr>
+          <w:trHeight w:val="2919"/>
+        </w:trPr>
+        <w:tc>
+          <w:tcPr>
+            <w:tcW w:w="4691" w:type="dxa"/>
+            <w:tcBorders>
+              <w:top w:val="nil"/>
+              <w:left w:val="nil"/>
+              <w:bottom w:val="nil"/>
+              <w:right w:val="nil"/>
+            </w:tcBorders>
+          </w:tcPr>
+          <w:p>
+            <w:pPr>
+              <w:pStyle w:val="TableParagraph"/>
+              <w:pBdr>
+                <w:top w:val="nil"/>
+                <w:left w:val="nil"/>
+                <w:bottom w:val="nil"/>
+                <w:right w:val="nil"/>
+                <w:between w:val="nil"/>
+              </w:pBdr>
+              <w:jc w:val="center"/>
+              <w:rPr>
+                <w:b/>
+                <w:sz w:val="20"/>
+              </w:rPr>
+            </w:pPr>
+          </w:p>
+          <w:p>
+            <w:pPr>
+              <w:pStyle w:val="TableParagraph"/>
+              <w:pBdr>
+                <w:top w:val="nil"/>
+                <w:left w:val="nil"/>
+                <w:bottom w:val="nil"/>
+                <w:right w:val="nil"/>
+                <w:between w:val="nil"/>
+              </w:pBdr>
+              <w:spacing w:line="224" w:lineRule="exact"/>
+              <w:ind w:right="580"/>
+              <w:jc w:val="center"/>
+              <w:rPr>
+                <w:rFonts w:ascii="Trebuchet MS" w:hAnsi="Trebuchet MS"/>
+                <w:sz w:val="20"/>
+                <w:szCs w:val="20"/>
+              </w:rPr>
+            </w:pPr>
+            <w:r>
+              <w:rPr>
+                <w:rFonts w:ascii="Trebuchet MS" w:hAnsi="Trebuchet MS"/>
+                <w:sz w:val="20"/>
+                <w:szCs w:val="20"/>
+              </w:rPr>
+              <w:t>Orientador:</w:t>
+            </w:r>
+            <w:r>
+              <w:rPr>
+                <w:rFonts w:ascii="Trebuchet MS" w:hAnsi="Trebuchet MS"/>
+                <w:spacing w:val="16"/>
+                <w:sz w:val="20"/>
+                <w:szCs w:val="20"/>
+              </w:rPr>
+              <w:t xml:space="preserve"> </w:t>
+            </w:r>
+            <w:r>
+              <w:br/>
+            </w:r>
+            <w:r>
+              <w:rPr>
+                <w:rFonts w:ascii="Trebuchet MS" w:hAnsi="Trebuchet MS"/>
+                <w:sz w:val="20"/>
+                <w:szCs w:val="20"/>
+              </w:rPr>
+              <w:t xml:space="preserve">        Jefferson</w:t>
+            </w:r>
+            <w:r>
+              <w:rPr>
+                <w:rFonts w:ascii="Trebuchet MS" w:hAnsi="Trebuchet MS"/>
+                <w:spacing w:val="16"/>
+                <w:sz w:val="20"/>
+                <w:szCs w:val="20"/>
+              </w:rPr>
+              <w:t xml:space="preserve"> </w:t>
+            </w:r>
+            <w:r>
+              <w:rPr>
+                <w:rFonts w:ascii="Trebuchet MS" w:hAnsi="Trebuchet MS"/>
+                <w:sz w:val="20"/>
+                <w:szCs w:val="20"/>
+              </w:rPr>
+              <w:t>Antonio</w:t>
+            </w:r>
+            <w:r>
+              <w:rPr>
+                <w:rFonts w:ascii="Trebuchet MS" w:hAnsi="Trebuchet MS"/>
+                <w:spacing w:val="17"/>
+                <w:sz w:val="20"/>
+                <w:szCs w:val="20"/>
+              </w:rPr>
+              <w:t xml:space="preserve"> </w:t>
+            </w:r>
+            <w:r>
+              <w:rPr>
+                <w:rFonts w:ascii="Trebuchet MS" w:hAnsi="Trebuchet MS"/>
+                <w:sz w:val="20"/>
+                <w:szCs w:val="20"/>
+              </w:rPr>
+              <w:t>Ribeiro</w:t>
+            </w:r>
+            <w:r>
+              <w:rPr>
+                <w:rFonts w:ascii="Trebuchet MS" w:hAnsi="Trebuchet MS"/>
+                <w:spacing w:val="16"/>
+                <w:sz w:val="20"/>
+                <w:szCs w:val="20"/>
+              </w:rPr>
+              <w:t xml:space="preserve"> </w:t>
+            </w:r>
+            <w:r>
+              <w:rPr>
+                <w:rFonts w:ascii="Trebuchet MS" w:hAnsi="Trebuchet MS"/>
+                <w:spacing w:val="-2"/>
+                <w:sz w:val="20"/>
+                <w:szCs w:val="20"/>
+              </w:rPr>
+              <w:t>Passerini</w:t>
+            </w:r>
+          </w:p>
+        </w:tc>
+        <w:tc>
+          <w:tcPr>
+            <w:tcW w:w="3714" w:type="dxa"/>
+            <w:tcBorders>
+              <w:top w:val="nil"/>
+              <w:left w:val="nil"/>
+              <w:bottom w:val="nil"/>
+              <w:right w:val="nil"/>
+            </w:tcBorders>
+          </w:tcPr>
+          <w:p>
+            <w:pPr>
+              <w:pStyle w:val="TableParagraph"/>
+              <w:pBdr>
+                <w:top w:val="nil"/>
+                <w:left w:val="nil"/>
+                <w:bottom w:val="nil"/>
+                <w:right w:val="nil"/>
+                <w:between w:val="nil"/>
+              </w:pBdr>
+              <w:rPr>
+                <w:rFonts w:ascii="Times New Roman" w:hAnsi="Times New Roman"/>
+                <w:sz w:val="20"/>
+              </w:rPr>
+            </w:pPr>
+          </w:p>
+        </w:tc>
+      </w:tr>
+    </w:tbl>
+    <w:p/>
     <w:sectPr>
       <w:pgSz w:w="11906" w:h="16838"/>
       <w:pgMar w:top="720" w:right="720" w:bottom="720" w:left="993" w:header="708" w:footer="708" w:gutter="0"/>
@@ -1551,7 +2076,7 @@
     <w:lsdException w:name="Closing" w:semiHidden="1" w:unhideWhenUsed="1"/>
     <w:lsdException w:name="Signature" w:semiHidden="1" w:unhideWhenUsed="1"/>
     <w:lsdException w:name="Default Paragraph Font" w:semiHidden="1" w:uiPriority="1" w:unhideWhenUsed="1"/>
-    <w:lsdException w:name="Body Text" w:semiHidden="1" w:unhideWhenUsed="1"/>
+    <w:lsdException w:name="Body Text" w:semiHidden="1" w:uiPriority="1" w:unhideWhenUsed="1" w:qFormat="1"/>
     <w:lsdException w:name="Body Text Indent" w:semiHidden="1" w:unhideWhenUsed="1"/>
     <w:lsdException w:name="List Continue" w:semiHidden="1" w:unhideWhenUsed="1"/>
     <w:lsdException w:name="List Continue 2" w:semiHidden="1" w:unhideWhenUsed="1"/>
@@ -2068,7 +2593,6 @@
   <w:style w:type="character" w:default="1" w:styleId="Fontepargpadro">
     <w:name w:val="Default Paragraph Font"/>
     <w:uiPriority w:val="1"/>
-    <w:semiHidden/>
     <w:unhideWhenUsed/>
   </w:style>
   <w:style w:type="table" w:default="1" w:styleId="Tabelanormal">
@@ -2444,6 +2968,60 @@
         <w:insideV w:val="single" w:sz="4" w:space="0" w:color="auto"/>
       </w:tblBorders>
     </w:tblPr>
+  </w:style>
+  <w:style w:type="character" w:customStyle="1" w:styleId="CorpodetextoChar">
+    <w:name w:val="Corpo de texto Char"/>
+    <w:basedOn w:val="Fontepargpadro"/>
+    <w:link w:val="Corpodetexto"/>
+    <w:uiPriority w:val="1"/>
+    <w:qFormat/>
+    <w:rsid w:val="003F7C04"/>
+    <w:rPr>
+      <w:rFonts w:ascii="Calibri" w:eastAsia="Calibri" w:hAnsi="Calibri" w:cs="Calibri"/>
+      <w:lang w:val="pt-PT"/>
+      <w14:ligatures w14:val="none"/>
+    </w:rPr>
+  </w:style>
+  <w:style w:type="paragraph" w:styleId="Corpodetexto">
+    <w:name w:val="Body Text"/>
+    <w:basedOn w:val="Normal"/>
+    <w:link w:val="CorpodetextoChar"/>
+    <w:uiPriority w:val="1"/>
+    <w:qFormat/>
+    <w:rsid w:val="003F7C04"/>
+    <w:pPr>
+      <w:widowControl w:val="0"/>
+      <w:spacing w:after="0" w:line="240" w:lineRule="auto"/>
+    </w:pPr>
+    <w:rPr>
+      <w:rFonts w:ascii="Calibri" w:eastAsia="Calibri" w:hAnsi="Calibri" w:cs="Calibri"/>
+      <w:lang w:val="pt-PT"/>
+      <w14:ligatures w14:val="none"/>
+    </w:rPr>
+  </w:style>
+  <w:style w:type="character" w:customStyle="1" w:styleId="CorpodetextoChar1">
+    <w:name w:val="Corpo de texto Char1"/>
+    <w:basedOn w:val="Fontepargpadro"/>
+    <w:uiPriority w:val="99"/>
+    <w:semiHidden/>
+    <w:rsid w:val="003F7C04"/>
+  </w:style>
+  <w:style w:type="paragraph" w:customStyle="1" w:styleId="TableParagraph">
+    <w:name w:val="Table Paragraph"/>
+    <w:basedOn w:val="Normal"/>
+    <w:uiPriority w:val="1"/>
+    <w:qFormat/>
+    <w:rsid w:val="003F7C04"/>
+    <w:pPr>
+      <w:widowControl w:val="0"/>
+      <w:spacing w:after="0" w:line="240" w:lineRule="auto"/>
+    </w:pPr>
+    <w:rPr>
+      <w:rFonts w:ascii="Calibri" w:eastAsia="Calibri" w:hAnsi="Calibri" w:cs="Calibri"/>
+      <w:kern w:val="0"/>
+      <w:lang w:val="pt-PT"/>
+      <w14:ligatures w14:val="none"/>
+    </w:rPr>
   </w:style>
 </w:styles>
 </file>

</xml_diff>